<commit_message>
thiếu search theo các trường, cần  thêm loại VKTB
</commit_message>
<xml_diff>
--- a/CSKT/originaldb-gate-fe/public/template.docx
+++ b/CSKT/originaldb-gate-fe/public/template.docx
@@ -5,6 +5,10 @@
     <w:p>
       <w:pPr>
         <w:spacing w:line="276" w:lineRule="auto"/>
+        <w:rPr>
+          <w:sz w:val="28"/>
+          <w:szCs w:val="28"/>
+        </w:rPr>
       </w:pPr>
     </w:p>
     <w:tbl>
@@ -237,8 +241,8 @@
                   <w:r>
                     <w:rPr>
                       <w:noProof/>
-                      <w:sz w:val="28"/>
-                      <w:szCs w:val="28"/>
+                      <w:sz w:val="26"/>
+                      <w:szCs w:val="26"/>
                     </w:rPr>
                     <mc:AlternateContent>
                       <mc:Choice Requires="wps">
@@ -340,8 +344,8 @@
                     <w:jc w:val="center"/>
                     <w:rPr>
                       <w:i/>
-                      <w:sz w:val="26"/>
-                      <w:szCs w:val="26"/>
+                      <w:sz w:val="28"/>
+                      <w:szCs w:val="28"/>
                     </w:rPr>
                   </w:pPr>
                 </w:p>
@@ -381,7 +385,25 @@
                       <w:sz w:val="28"/>
                       <w:szCs w:val="28"/>
                     </w:rPr>
-                    <w:t>{date}</w:t>
+                    <w:t>ngày</w:t>
+                  </w:r>
+                  <w:r>
+                    <w:rPr>
+                      <w:i/>
+                      <w:noProof/>
+                      <w:sz w:val="28"/>
+                      <w:szCs w:val="28"/>
+                    </w:rPr>
+                    <w:t xml:space="preserve"> {day} tháng {month} năm {year</w:t>
+                  </w:r>
+                  <w:r>
+                    <w:rPr>
+                      <w:i/>
+                      <w:noProof/>
+                      <w:sz w:val="28"/>
+                      <w:szCs w:val="28"/>
+                    </w:rPr>
+                    <w:t>}</w:t>
                   </w:r>
                 </w:p>
               </w:tc>
@@ -393,8 +415,8 @@
               <w:jc w:val="center"/>
               <w:rPr>
                 <w:spacing w:val="-20"/>
-                <w:sz w:val="26"/>
-                <w:szCs w:val="26"/>
+                <w:sz w:val="28"/>
+                <w:szCs w:val="28"/>
               </w:rPr>
             </w:pPr>
           </w:p>
@@ -413,8 +435,8 @@
               <w:jc w:val="center"/>
               <w:rPr>
                 <w:b/>
-                <w:sz w:val="26"/>
-                <w:szCs w:val="26"/>
+                <w:sz w:val="28"/>
+                <w:szCs w:val="28"/>
               </w:rPr>
             </w:pPr>
           </w:p>
@@ -439,8 +461,8 @@
               <w:spacing w:before="100" w:beforeAutospacing="1" w:line="276" w:lineRule="auto"/>
               <w:rPr>
                 <w:i/>
-                <w:sz w:val="26"/>
-                <w:szCs w:val="26"/>
+                <w:sz w:val="28"/>
+                <w:szCs w:val="28"/>
               </w:rPr>
             </w:pPr>
           </w:p>
@@ -470,130 +492,223 @@
     </w:tbl>
     <w:p>
       <w:pPr>
-        <w:spacing w:after="240" w:line="276" w:lineRule="auto"/>
+        <w:spacing w:line="276" w:lineRule="auto"/>
         <w:jc w:val="center"/>
         <w:rPr>
           <w:b/>
-          <w:sz w:val="32"/>
-          <w:szCs w:val="32"/>
+          <w:sz w:val="28"/>
+          <w:szCs w:val="28"/>
         </w:rPr>
       </w:pPr>
       <w:r>
         <w:rPr>
           <w:b/>
-          <w:sz w:val="32"/>
-          <w:szCs w:val="32"/>
+          <w:sz w:val="28"/>
+          <w:szCs w:val="28"/>
         </w:rPr>
         <w:t xml:space="preserve">BIÊN </w:t>
       </w:r>
       <w:r>
         <w:rPr>
           <w:b/>
-          <w:sz w:val="32"/>
-          <w:szCs w:val="32"/>
-        </w:rPr>
-        <w:t>BẢN BÀN GIAO</w:t>
+          <w:sz w:val="28"/>
+          <w:szCs w:val="28"/>
+        </w:rPr>
+        <w:t>BẢN</w:t>
       </w:r>
     </w:p>
     <w:p>
       <w:pPr>
         <w:spacing w:line="276" w:lineRule="auto"/>
-        <w:jc w:val="both"/>
-        <w:rPr>
-          <w:sz w:val="28"/>
-          <w:szCs w:val="28"/>
-        </w:rPr>
-      </w:pPr>
-      <w:r>
-        <w:rPr>
-          <w:sz w:val="28"/>
-          <w:szCs w:val="28"/>
-        </w:rPr>
-        <w:tab/>
-        <w:t>Hôm nay</w:t>
-      </w:r>
-      <w:r>
-        <w:rPr>
-          <w:sz w:val="28"/>
-          <w:szCs w:val="28"/>
-        </w:rPr>
-        <w:t>,</w:t>
-      </w:r>
-      <w:r>
-        <w:rPr>
+        <w:jc w:val="center"/>
+        <w:rPr>
+          <w:b/>
+          <w:sz w:val="28"/>
+          <w:szCs w:val="28"/>
+        </w:rPr>
+      </w:pPr>
+      <w:r>
+        <w:rPr>
+          <w:b/>
           <w:noProof/>
           <w:sz w:val="28"/>
           <w:szCs w:val="28"/>
         </w:rPr>
-        <w:t xml:space="preserve"> {date}</w:t>
-      </w:r>
-      <w:r>
-        <w:rPr>
-          <w:noProof/>
-          <w:sz w:val="28"/>
-          <w:szCs w:val="28"/>
-        </w:rPr>
-        <w:t xml:space="preserve"> </w:t>
-      </w:r>
-      <w:r>
-        <w:rPr>
-          <w:noProof/>
-          <w:sz w:val="28"/>
-          <w:szCs w:val="28"/>
-        </w:rPr>
-        <w:t>,</w:t>
-      </w:r>
-      <w:r>
-        <w:rPr>
-          <w:sz w:val="28"/>
-          <w:szCs w:val="28"/>
-        </w:rPr>
-        <w:t xml:space="preserve"> chúng tôi thực hiện bàn giao</w:t>
-      </w:r>
-      <w:r>
-        <w:rPr>
-          <w:sz w:val="28"/>
-          <w:szCs w:val="28"/>
-        </w:rPr>
-        <w:t xml:space="preserve"> </w:t>
-      </w:r>
-      <w:r>
-        <w:rPr>
-          <w:sz w:val="28"/>
-          <w:szCs w:val="28"/>
-        </w:rPr>
-        <w:t>bảng mạch CIENA phục vụ di chuyển trạm Q11</w:t>
-      </w:r>
-      <w:r>
-        <w:rPr>
-          <w:sz w:val="28"/>
-          <w:szCs w:val="28"/>
-        </w:rPr>
-        <w:t>, cụ thể</w:t>
-      </w:r>
-      <w:r>
-        <w:rPr>
-          <w:sz w:val="28"/>
-          <w:szCs w:val="28"/>
-        </w:rPr>
-        <w:t xml:space="preserve"> </w:t>
-      </w:r>
-      <w:r>
-        <w:rPr>
-          <w:sz w:val="28"/>
-          <w:szCs w:val="28"/>
-        </w:rPr>
-        <w:t>như sau:</w:t>
+        <mc:AlternateContent>
+          <mc:Choice Requires="wps">
+            <w:drawing>
+              <wp:anchor distT="0" distB="0" distL="114300" distR="114300" simplePos="0" relativeHeight="251661312" behindDoc="0" locked="0" layoutInCell="1" allowOverlap="1" wp14:anchorId="5516B2BB" wp14:editId="2A1B49D0">
+                <wp:simplePos x="0" y="0"/>
+                <wp:positionH relativeFrom="column">
+                  <wp:posOffset>2225674</wp:posOffset>
+                </wp:positionH>
+                <wp:positionV relativeFrom="paragraph">
+                  <wp:posOffset>203200</wp:posOffset>
+                </wp:positionV>
+                <wp:extent cx="1495425" cy="0"/>
+                <wp:effectExtent l="0" t="0" r="28575" b="19050"/>
+                <wp:wrapNone/>
+                <wp:docPr id="3" name="Straight Connector 3"/>
+                <wp:cNvGraphicFramePr/>
+                <a:graphic xmlns:a="http://schemas.openxmlformats.org/drawingml/2006/main">
+                  <a:graphicData uri="http://schemas.microsoft.com/office/word/2010/wordprocessingShape">
+                    <wps:wsp>
+                      <wps:cNvCnPr/>
+                      <wps:spPr>
+                        <a:xfrm flipV="1">
+                          <a:off x="0" y="0"/>
+                          <a:ext cx="1495425" cy="0"/>
+                        </a:xfrm>
+                        <a:prstGeom prst="line">
+                          <a:avLst/>
+                        </a:prstGeom>
+                      </wps:spPr>
+                      <wps:style>
+                        <a:lnRef idx="1">
+                          <a:schemeClr val="dk1"/>
+                        </a:lnRef>
+                        <a:fillRef idx="0">
+                          <a:schemeClr val="dk1"/>
+                        </a:fillRef>
+                        <a:effectRef idx="0">
+                          <a:schemeClr val="dk1"/>
+                        </a:effectRef>
+                        <a:fontRef idx="minor">
+                          <a:schemeClr val="tx1"/>
+                        </a:fontRef>
+                      </wps:style>
+                      <wps:bodyPr/>
+                    </wps:wsp>
+                  </a:graphicData>
+                </a:graphic>
+                <wp14:sizeRelH relativeFrom="margin">
+                  <wp14:pctWidth>0</wp14:pctWidth>
+                </wp14:sizeRelH>
+                <wp14:sizeRelV relativeFrom="margin">
+                  <wp14:pctHeight>0</wp14:pctHeight>
+                </wp14:sizeRelV>
+              </wp:anchor>
+            </w:drawing>
+          </mc:Choice>
+          <mc:Fallback>
+            <w:pict>
+              <v:line w14:anchorId="5EE7937A" id="Straight Connector 3" o:spid="_x0000_s1026" style="position:absolute;flip:y;z-index:251661312;visibility:visible;mso-wrap-style:square;mso-width-percent:0;mso-height-percent:0;mso-wrap-distance-left:9pt;mso-wrap-distance-top:0;mso-wrap-distance-right:9pt;mso-wrap-distance-bottom:0;mso-position-horizontal:absolute;mso-position-horizontal-relative:text;mso-position-vertical:absolute;mso-position-vertical-relative:text;mso-width-percent:0;mso-height-percent:0;mso-width-relative:margin;mso-height-relative:margin" from="175.25pt,16pt" to="293pt,16pt" o:gfxdata="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" strokecolor="black [3040]"/>
+            </w:pict>
+          </mc:Fallback>
+        </mc:AlternateContent>
+      </w:r>
+      <w:r>
+        <w:rPr>
+          <w:b/>
+          <w:sz w:val="28"/>
+          <w:szCs w:val="28"/>
+        </w:rPr>
+        <w:t>{title}</w:t>
       </w:r>
     </w:p>
     <w:p>
       <w:pPr>
+        <w:spacing w:line="276" w:lineRule="auto"/>
+        <w:jc w:val="center"/>
+        <w:rPr>
+          <w:b/>
+          <w:sz w:val="28"/>
+          <w:szCs w:val="28"/>
+        </w:rPr>
+      </w:pPr>
+    </w:p>
+    <w:p>
+      <w:pPr>
+        <w:spacing w:line="276" w:lineRule="auto"/>
+        <w:jc w:val="both"/>
+        <w:rPr>
+          <w:sz w:val="28"/>
+          <w:szCs w:val="28"/>
+        </w:rPr>
+      </w:pPr>
+      <w:r>
+        <w:rPr>
+          <w:sz w:val="28"/>
+          <w:szCs w:val="28"/>
+        </w:rPr>
+        <w:tab/>
+        <w:t>Hôm nay,</w:t>
+      </w:r>
+      <w:r>
+        <w:rPr>
+          <w:noProof/>
+          <w:sz w:val="28"/>
+          <w:szCs w:val="28"/>
+        </w:rPr>
+        <w:t xml:space="preserve"> ngày {day} tháng {month} năm {year}</w:t>
+      </w:r>
+      <w:r>
+        <w:rPr>
+          <w:noProof/>
+          <w:sz w:val="28"/>
+          <w:szCs w:val="28"/>
+        </w:rPr>
+        <w:t xml:space="preserve"> </w:t>
+      </w:r>
+      <w:r>
+        <w:rPr>
+          <w:noProof/>
+          <w:sz w:val="28"/>
+          <w:szCs w:val="28"/>
+        </w:rPr>
+        <w:t>,</w:t>
+      </w:r>
+      <w:r>
+        <w:rPr>
+          <w:sz w:val="28"/>
+          <w:szCs w:val="28"/>
+        </w:rPr>
+        <w:t xml:space="preserve"> chúng tôi thực hiện</w:t>
+      </w:r>
+      <w:r>
+        <w:rPr>
+          <w:sz w:val="28"/>
+          <w:szCs w:val="28"/>
+        </w:rPr>
+        <w:t xml:space="preserve"> {content</w:t>
+      </w:r>
+      <w:r>
+        <w:rPr>
+          <w:sz w:val="28"/>
+          <w:szCs w:val="28"/>
+        </w:rPr>
+        <w:t>}</w:t>
+      </w:r>
+      <w:r>
+        <w:rPr>
+          <w:sz w:val="28"/>
+          <w:szCs w:val="28"/>
+        </w:rPr>
+        <w:t>, cụ thể</w:t>
+      </w:r>
+      <w:r>
+        <w:rPr>
+          <w:sz w:val="28"/>
+          <w:szCs w:val="28"/>
+        </w:rPr>
+        <w:t xml:space="preserve"> </w:t>
+      </w:r>
+      <w:r>
+        <w:rPr>
+          <w:sz w:val="28"/>
+          <w:szCs w:val="28"/>
+        </w:rPr>
+        <w:t>như sau:</w:t>
+      </w:r>
+    </w:p>
+    <w:p>
+      <w:pPr>
         <w:spacing w:before="120" w:after="120" w:line="276" w:lineRule="auto"/>
         <w:jc w:val="both"/>
         <w:rPr>
           <w:b/>
-          <w:sz w:val="26"/>
-          <w:szCs w:val="26"/>
+          <w:sz w:val="28"/>
+          <w:szCs w:val="28"/>
         </w:rPr>
       </w:pPr>
       <w:r>
@@ -606,38 +721,80 @@
       <w:r>
         <w:rPr>
           <w:b/>
-          <w:sz w:val="26"/>
-          <w:szCs w:val="26"/>
-        </w:rPr>
-        <w:t xml:space="preserve">I. </w:t>
+          <w:sz w:val="28"/>
+          <w:szCs w:val="28"/>
+        </w:rPr>
+        <w:t>* Bên giao</w:t>
       </w:r>
       <w:r>
         <w:rPr>
           <w:b/>
-          <w:sz w:val="26"/>
-          <w:szCs w:val="26"/>
-        </w:rPr>
-        <w:t xml:space="preserve">BÊN GIAO: </w:t>
+          <w:sz w:val="28"/>
+          <w:szCs w:val="28"/>
+        </w:rPr>
+        <w:t xml:space="preserve">: </w:t>
       </w:r>
       <w:r>
         <w:rPr>
           <w:b/>
-          <w:sz w:val="26"/>
-          <w:szCs w:val="26"/>
-        </w:rPr>
-        <w:t>PHÒNG KT TD-TTVT</w:t>
+          <w:sz w:val="28"/>
+          <w:szCs w:val="28"/>
+        </w:rPr>
+        <w:t>{org_delivery</w:t>
       </w:r>
       <w:r>
         <w:rPr>
           <w:b/>
-          <w:sz w:val="26"/>
-          <w:szCs w:val="26"/>
-        </w:rPr>
-        <w:t>/ TRUNG TÂM KTTT CNC</w:t>
-      </w:r>
+          <w:sz w:val="28"/>
+          <w:szCs w:val="28"/>
+        </w:rPr>
+        <w:t>}</w:t>
+      </w:r>
+      <w:bookmarkStart w:id="0" w:name="_GoBack"/>
+      <w:bookmarkEnd w:id="0"/>
     </w:p>
     <w:p>
       <w:pPr>
+        <w:spacing w:before="120" w:after="120" w:line="276" w:lineRule="auto"/>
+        <w:jc w:val="both"/>
+        <w:rPr>
+          <w:b/>
+          <w:sz w:val="28"/>
+          <w:szCs w:val="28"/>
+        </w:rPr>
+      </w:pPr>
+      <w:r>
+        <w:rPr>
+          <w:b/>
+          <w:sz w:val="28"/>
+          <w:szCs w:val="28"/>
+        </w:rPr>
+        <w:tab/>
+      </w:r>
+      <w:r>
+        <w:rPr>
+          <w:sz w:val="28"/>
+          <w:szCs w:val="28"/>
+        </w:rPr>
+        <w:t>Đ/c: {deliverer_rank} {</w:t>
+      </w:r>
+      <w:r>
+        <w:rPr>
+          <w:sz w:val="28"/>
+          <w:szCs w:val="28"/>
+        </w:rPr>
+        <w:t>deliverer</w:t>
+      </w:r>
+      <w:r>
+        <w:rPr>
+          <w:sz w:val="28"/>
+          <w:szCs w:val="28"/>
+        </w:rPr>
+        <w:t>}</w:t>
+      </w:r>
+    </w:p>
+    <w:p>
+      <w:pPr>
         <w:spacing w:line="276" w:lineRule="auto"/>
         <w:jc w:val="both"/>
         <w:rPr>
@@ -650,42 +807,28 @@
           <w:sz w:val="28"/>
           <w:szCs w:val="28"/>
         </w:rPr>
-        <w:t xml:space="preserve">          </w:t>
-      </w:r>
-      <w:r>
-        <w:rPr>
-          <w:sz w:val="28"/>
-          <w:szCs w:val="28"/>
-        </w:rPr>
-        <w:t>1.</w:t>
-      </w:r>
-      <w:r>
-        <w:rPr>
-          <w:sz w:val="28"/>
-          <w:szCs w:val="28"/>
-        </w:rPr>
-        <w:t xml:space="preserve"> </w:t>
-      </w:r>
-      <w:r>
-        <w:rPr>
-          <w:sz w:val="28"/>
-          <w:szCs w:val="28"/>
-        </w:rPr>
-        <w:t xml:space="preserve"> </w:t>
-      </w:r>
-      <w:r>
-        <w:rPr>
-          <w:sz w:val="28"/>
-          <w:szCs w:val="28"/>
-        </w:rPr>
-        <w:t xml:space="preserve">Đ/c: </w:t>
-      </w:r>
-      <w:r>
-        <w:rPr>
-          <w:sz w:val="28"/>
-          <w:szCs w:val="28"/>
-        </w:rPr>
-        <w:t>{name}</w:t>
+        <w:tab/>
+      </w:r>
+      <w:r>
+        <w:rPr>
+          <w:sz w:val="28"/>
+          <w:szCs w:val="28"/>
+        </w:rPr>
+        <w:t xml:space="preserve">Chức vụ: </w:t>
+      </w:r>
+      <w:r>
+        <w:rPr>
+          <w:sz w:val="28"/>
+          <w:szCs w:val="28"/>
+        </w:rPr>
+        <w:t>{position_deliverer</w:t>
+      </w:r>
+      <w:r>
+        <w:rPr>
+          <w:sz w:val="28"/>
+          <w:szCs w:val="28"/>
+        </w:rPr>
+        <w:t>}</w:t>
       </w:r>
     </w:p>
     <w:p>
@@ -693,54 +836,137 @@
         <w:spacing w:line="276" w:lineRule="auto"/>
         <w:jc w:val="both"/>
         <w:rPr>
-          <w:sz w:val="28"/>
-          <w:szCs w:val="28"/>
-        </w:rPr>
-      </w:pPr>
-      <w:r>
-        <w:rPr>
+          <w:b/>
+          <w:sz w:val="28"/>
+          <w:szCs w:val="28"/>
+        </w:rPr>
+      </w:pPr>
+      <w:r>
+        <w:rPr>
+          <w:b/>
+          <w:i/>
           <w:sz w:val="28"/>
           <w:szCs w:val="28"/>
         </w:rPr>
         <w:tab/>
-        <w:t xml:space="preserve">   </w:t>
-      </w:r>
-      <w:r>
-        <w:rPr>
-          <w:sz w:val="28"/>
-          <w:szCs w:val="28"/>
-        </w:rPr>
-        <w:t xml:space="preserve">  </w:t>
-      </w:r>
-      <w:r>
-        <w:rPr>
-          <w:sz w:val="28"/>
-          <w:szCs w:val="28"/>
-        </w:rPr>
-        <w:t xml:space="preserve">Chức vụ: </w:t>
-      </w:r>
-      <w:r>
-        <w:rPr>
-          <w:sz w:val="28"/>
-          <w:szCs w:val="28"/>
-        </w:rPr>
-        <w:t>Trợ lý</w:t>
+      </w:r>
+      <w:r>
+        <w:rPr>
+          <w:b/>
+          <w:sz w:val="28"/>
+          <w:szCs w:val="28"/>
+        </w:rPr>
+        <w:t xml:space="preserve">* Bên nhận: </w:t>
+      </w:r>
+      <w:r>
+        <w:rPr>
+          <w:b/>
+          <w:sz w:val="28"/>
+          <w:szCs w:val="28"/>
+        </w:rPr>
+        <w:t>{org_receive}</w:t>
       </w:r>
     </w:p>
     <w:p>
       <w:pPr>
+        <w:spacing w:line="276" w:lineRule="auto"/>
+        <w:jc w:val="both"/>
+        <w:rPr>
+          <w:b/>
+          <w:sz w:val="28"/>
+          <w:szCs w:val="28"/>
+        </w:rPr>
+      </w:pPr>
+      <w:r>
+        <w:rPr>
+          <w:b/>
+          <w:sz w:val="28"/>
+          <w:szCs w:val="28"/>
+        </w:rPr>
+        <w:tab/>
+      </w:r>
+      <w:r>
+        <w:rPr>
+          <w:sz w:val="28"/>
+          <w:szCs w:val="28"/>
+        </w:rPr>
+        <w:t>Đ/c</w:t>
+      </w:r>
+      <w:r>
+        <w:rPr>
+          <w:sz w:val="28"/>
+          <w:szCs w:val="28"/>
+        </w:rPr>
+        <w:t xml:space="preserve">: </w:t>
+      </w:r>
+      <w:r>
+        <w:rPr>
+          <w:sz w:val="28"/>
+          <w:szCs w:val="28"/>
+        </w:rPr>
+        <w:t>{receiver_rank}</w:t>
+      </w:r>
+      <w:r>
+        <w:rPr>
+          <w:sz w:val="28"/>
+          <w:szCs w:val="28"/>
+        </w:rPr>
+        <w:t xml:space="preserve"> </w:t>
+      </w:r>
+      <w:r>
+        <w:rPr>
+          <w:sz w:val="28"/>
+          <w:szCs w:val="28"/>
+        </w:rPr>
+        <w:t>{receiver}</w:t>
+      </w:r>
+    </w:p>
+    <w:p>
+      <w:pPr>
+        <w:spacing w:line="276" w:lineRule="auto"/>
+        <w:jc w:val="both"/>
+        <w:rPr>
+          <w:b/>
+          <w:sz w:val="28"/>
+          <w:szCs w:val="28"/>
+        </w:rPr>
+      </w:pPr>
+      <w:r>
+        <w:rPr>
+          <w:b/>
+          <w:sz w:val="28"/>
+          <w:szCs w:val="28"/>
+        </w:rPr>
+        <w:tab/>
+      </w:r>
+      <w:r>
+        <w:rPr>
+          <w:sz w:val="28"/>
+          <w:szCs w:val="28"/>
+        </w:rPr>
+        <w:t xml:space="preserve">Chức vụ: </w:t>
+      </w:r>
+      <w:r>
+        <w:rPr>
+          <w:sz w:val="28"/>
+          <w:szCs w:val="28"/>
+        </w:rPr>
+        <w:t>{position_receiver}</w:t>
+      </w:r>
+    </w:p>
+    <w:p>
+      <w:pPr>
         <w:spacing w:before="120" w:after="120" w:line="276" w:lineRule="auto"/>
         <w:jc w:val="both"/>
         <w:rPr>
           <w:b/>
-          <w:sz w:val="26"/>
-          <w:szCs w:val="26"/>
+          <w:sz w:val="28"/>
+          <w:szCs w:val="28"/>
         </w:rPr>
       </w:pPr>
       <w:r>
         <w:rPr>
           <w:b/>
-          <w:i/>
           <w:sz w:val="28"/>
           <w:szCs w:val="28"/>
         </w:rPr>
@@ -749,134 +975,10 @@
       <w:r>
         <w:rPr>
           <w:b/>
-          <w:sz w:val="26"/>
-          <w:szCs w:val="26"/>
-        </w:rPr>
-        <w:t xml:space="preserve">II. </w:t>
-      </w:r>
-      <w:r>
-        <w:rPr>
-          <w:b/>
-          <w:sz w:val="26"/>
-          <w:szCs w:val="26"/>
-        </w:rPr>
-        <w:t xml:space="preserve">BÊN NHẬN: </w:t>
-      </w:r>
-      <w:r>
-        <w:rPr>
-          <w:b/>
-          <w:sz w:val="26"/>
-          <w:szCs w:val="26"/>
-        </w:rPr>
-        <w:t>TIỂU ĐOÀN 2/LỮ ĐOÀN 132</w:t>
-      </w:r>
-    </w:p>
-    <w:p>
-      <w:pPr>
-        <w:numPr>
-          <w:ilvl w:val="0"/>
-          <w:numId w:val="1"/>
-        </w:numPr>
-        <w:spacing w:line="276" w:lineRule="auto"/>
-        <w:jc w:val="both"/>
-        <w:rPr>
-          <w:sz w:val="28"/>
-          <w:szCs w:val="28"/>
-        </w:rPr>
-      </w:pPr>
-      <w:r>
-        <w:rPr>
-          <w:sz w:val="28"/>
-          <w:szCs w:val="28"/>
-        </w:rPr>
-        <w:t>Đ/c</w:t>
-      </w:r>
-      <w:r>
-        <w:rPr>
-          <w:sz w:val="28"/>
-          <w:szCs w:val="28"/>
-        </w:rPr>
-        <w:t xml:space="preserve">: </w:t>
-      </w:r>
-      <w:r>
-        <w:rPr>
-          <w:sz w:val="28"/>
-          <w:szCs w:val="28"/>
-        </w:rPr>
-        <w:t>1/</w:t>
-      </w:r>
-      <w:r>
-        <w:rPr>
-          <w:sz w:val="28"/>
-          <w:szCs w:val="28"/>
-        </w:rPr>
-        <w:t>/</w:t>
-      </w:r>
-      <w:r>
-        <w:rPr>
-          <w:sz w:val="28"/>
-          <w:szCs w:val="28"/>
-        </w:rPr>
-        <w:t xml:space="preserve"> </w:t>
-      </w:r>
-      <w:r>
-        <w:rPr>
-          <w:sz w:val="28"/>
-          <w:szCs w:val="28"/>
-        </w:rPr>
-        <w:t>Trần Văn An</w:t>
-      </w:r>
-    </w:p>
-    <w:p>
-      <w:pPr>
-        <w:spacing w:line="276" w:lineRule="auto"/>
-        <w:jc w:val="both"/>
-        <w:rPr>
-          <w:sz w:val="28"/>
-          <w:szCs w:val="28"/>
-        </w:rPr>
-      </w:pPr>
-      <w:r>
-        <w:rPr>
-          <w:sz w:val="28"/>
-          <w:szCs w:val="28"/>
-        </w:rPr>
-        <w:tab/>
-        <w:t xml:space="preserve">    </w:t>
-      </w:r>
-      <w:r>
-        <w:rPr>
-          <w:sz w:val="28"/>
-          <w:szCs w:val="28"/>
-        </w:rPr>
-        <w:t xml:space="preserve">Chức vụ: </w:t>
-      </w:r>
-      <w:r>
-        <w:rPr>
-          <w:sz w:val="28"/>
-          <w:szCs w:val="28"/>
-        </w:rPr>
-        <w:t>Nhân viên kỹ thuật</w:t>
-      </w:r>
-    </w:p>
-    <w:p>
-      <w:pPr>
-        <w:spacing w:before="120" w:after="120" w:line="276" w:lineRule="auto"/>
-        <w:jc w:val="both"/>
-        <w:rPr>
-          <w:b/>
-          <w:sz w:val="28"/>
-          <w:szCs w:val="28"/>
-        </w:rPr>
-      </w:pPr>
-      <w:r>
-        <w:rPr>
-          <w:b/>
-          <w:sz w:val="28"/>
-          <w:szCs w:val="28"/>
-        </w:rPr>
-        <w:tab/>
-        <w:t>III. NỘI DUNG BÀN GIAO</w:t>
+          <w:sz w:val="28"/>
+          <w:szCs w:val="28"/>
+        </w:rPr>
+        <w:t>* Nội dung bàn giao</w:t>
       </w:r>
     </w:p>
     <w:tbl>
@@ -894,12 +996,12 @@
         <w:tblLook w:val="04A0" w:firstRow="1" w:lastRow="0" w:firstColumn="1" w:lastColumn="0" w:noHBand="0" w:noVBand="1"/>
       </w:tblPr>
       <w:tblGrid>
-        <w:gridCol w:w="2211"/>
-        <w:gridCol w:w="1844"/>
-        <w:gridCol w:w="826"/>
-        <w:gridCol w:w="536"/>
-        <w:gridCol w:w="1960"/>
-        <w:gridCol w:w="1684"/>
+        <w:gridCol w:w="2004"/>
+        <w:gridCol w:w="948"/>
+        <w:gridCol w:w="805"/>
+        <w:gridCol w:w="1208"/>
+        <w:gridCol w:w="1780"/>
+        <w:gridCol w:w="2316"/>
       </w:tblGrid>
       <w:tr>
         <w:trPr>
@@ -909,7 +1011,7 @@
         </w:trPr>
         <w:tc>
           <w:tcPr>
-            <w:tcW w:w="891" w:type="pct"/>
+            <w:tcW w:w="643" w:type="pct"/>
             <w:tcBorders>
               <w:top w:val="single" w:sz="4" w:space="0" w:color="auto"/>
               <w:left w:val="single" w:sz="4" w:space="0" w:color="auto"/>
@@ -946,7 +1048,7 @@
         </w:tc>
         <w:tc>
           <w:tcPr>
-            <w:tcW w:w="1346" w:type="pct"/>
+            <w:tcW w:w="986" w:type="pct"/>
             <w:tcBorders>
               <w:top w:val="single" w:sz="4" w:space="0" w:color="auto"/>
               <w:left w:val="single" w:sz="4" w:space="0" w:color="auto"/>
@@ -981,7 +1083,7 @@
         </w:tc>
         <w:tc>
           <w:tcPr>
-            <w:tcW w:w="456" w:type="pct"/>
+            <w:tcW w:w="444" w:type="pct"/>
             <w:tcBorders>
               <w:top w:val="single" w:sz="4" w:space="0" w:color="auto"/>
               <w:left w:val="single" w:sz="4" w:space="0" w:color="auto"/>
@@ -1017,7 +1119,7 @@
         </w:tc>
         <w:tc>
           <w:tcPr>
-            <w:tcW w:w="296" w:type="pct"/>
+            <w:tcW w:w="667" w:type="pct"/>
             <w:tcBorders>
               <w:top w:val="single" w:sz="4" w:space="0" w:color="auto"/>
               <w:left w:val="single" w:sz="4" w:space="0" w:color="auto"/>
@@ -1053,7 +1155,7 @@
         </w:tc>
         <w:tc>
           <w:tcPr>
-            <w:tcW w:w="1082" w:type="pct"/>
+            <w:tcW w:w="982" w:type="pct"/>
             <w:tcBorders>
               <w:top w:val="single" w:sz="4" w:space="0" w:color="auto"/>
               <w:left w:val="single" w:sz="4" w:space="0" w:color="auto"/>
@@ -1089,7 +1191,7 @@
         </w:tc>
         <w:tc>
           <w:tcPr>
-            <w:tcW w:w="929" w:type="pct"/>
+            <w:tcW w:w="1278" w:type="pct"/>
             <w:tcBorders>
               <w:top w:val="single" w:sz="4" w:space="0" w:color="auto"/>
               <w:left w:val="single" w:sz="4" w:space="0" w:color="auto"/>
@@ -1110,8 +1212,6 @@
                 <w:lang w:val="es-ES"/>
               </w:rPr>
             </w:pPr>
-            <w:bookmarkStart w:id="0" w:name="_GoBack"/>
-            <w:bookmarkEnd w:id="0"/>
             <w:r>
               <w:rPr>
                 <w:rFonts w:eastAsia="Calibri"/>
@@ -1133,7 +1233,7 @@
         </w:trPr>
         <w:tc>
           <w:tcPr>
-            <w:tcW w:w="891" w:type="pct"/>
+            <w:tcW w:w="643" w:type="pct"/>
             <w:tcBorders>
               <w:top w:val="single" w:sz="4" w:space="0" w:color="auto"/>
               <w:left w:val="single" w:sz="4" w:space="0" w:color="auto"/>
@@ -1178,7 +1278,7 @@
         </w:tc>
         <w:tc>
           <w:tcPr>
-            <w:tcW w:w="1346" w:type="pct"/>
+            <w:tcW w:w="986" w:type="pct"/>
             <w:tcBorders>
               <w:top w:val="single" w:sz="4" w:space="0" w:color="auto"/>
               <w:left w:val="single" w:sz="4" w:space="0" w:color="auto"/>
@@ -1212,13 +1312,13 @@
                 <w:szCs w:val="28"/>
                 <w:lang w:val="es-ES"/>
               </w:rPr>
-              <w:t>device_name}</w:t>
+              <w:t>name}</w:t>
             </w:r>
           </w:p>
         </w:tc>
         <w:tc>
           <w:tcPr>
-            <w:tcW w:w="456" w:type="pct"/>
+            <w:tcW w:w="444" w:type="pct"/>
             <w:tcBorders>
               <w:top w:val="single" w:sz="4" w:space="0" w:color="auto"/>
               <w:left w:val="single" w:sz="4" w:space="0" w:color="auto"/>
@@ -1244,13 +1344,13 @@
                 <w:szCs w:val="28"/>
                 <w:lang w:val="es-ES"/>
               </w:rPr>
-              <w:t>Chiếc</w:t>
+              <w:t>{unit}</w:t>
             </w:r>
           </w:p>
         </w:tc>
         <w:tc>
           <w:tcPr>
-            <w:tcW w:w="296" w:type="pct"/>
+            <w:tcW w:w="667" w:type="pct"/>
             <w:tcBorders>
               <w:top w:val="single" w:sz="4" w:space="0" w:color="auto"/>
               <w:left w:val="single" w:sz="4" w:space="0" w:color="auto"/>
@@ -1274,20 +1374,13 @@
                 <w:sz w:val="28"/>
                 <w:szCs w:val="28"/>
               </w:rPr>
-              <w:t>0</w:t>
-            </w:r>
-            <w:r>
-              <w:rPr>
-                <w:sz w:val="28"/>
-                <w:szCs w:val="28"/>
-              </w:rPr>
-              <w:t>1</w:t>
+              <w:t>{quantity}</w:t>
             </w:r>
           </w:p>
         </w:tc>
         <w:tc>
           <w:tcPr>
-            <w:tcW w:w="1082" w:type="pct"/>
+            <w:tcW w:w="982" w:type="pct"/>
             <w:tcBorders>
               <w:top w:val="single" w:sz="4" w:space="0" w:color="auto"/>
               <w:left w:val="single" w:sz="4" w:space="0" w:color="auto"/>
@@ -1321,7 +1414,7 @@
         </w:tc>
         <w:tc>
           <w:tcPr>
-            <w:tcW w:w="929" w:type="pct"/>
+            <w:tcW w:w="1278" w:type="pct"/>
             <w:tcBorders>
               <w:top w:val="single" w:sz="4" w:space="0" w:color="auto"/>
               <w:left w:val="single" w:sz="4" w:space="0" w:color="auto"/>
@@ -1342,7 +1435,7 @@
                 <w:sz w:val="28"/>
                 <w:szCs w:val="28"/>
               </w:rPr>
-              <w:t>Tốt</w:t>
+              <w:t>{condition}</w:t>
             </w:r>
             <w:r>
               <w:rPr>
@@ -1366,6 +1459,25 @@
           <w:lang w:val="nl-NL"/>
         </w:rPr>
       </w:pPr>
+    </w:p>
+    <w:p>
+      <w:pPr>
+        <w:spacing w:before="120" w:line="276" w:lineRule="auto"/>
+        <w:jc w:val="both"/>
+        <w:rPr>
+          <w:sz w:val="28"/>
+          <w:szCs w:val="28"/>
+          <w:lang w:val="nl-NL"/>
+        </w:rPr>
+      </w:pPr>
+      <w:r>
+        <w:rPr>
+          <w:sz w:val="28"/>
+          <w:szCs w:val="28"/>
+          <w:lang w:val="nl-NL"/>
+        </w:rPr>
+        <w:tab/>
+      </w:r>
       <w:r>
         <w:rPr>
           <w:sz w:val="28"/>
@@ -1588,12 +1700,12 @@
           <w:p>
             <w:pPr>
               <w:spacing w:line="276" w:lineRule="auto"/>
+              <w:ind w:left="1080"/>
               <w:jc w:val="center"/>
               <w:rPr>
                 <w:b/>
                 <w:sz w:val="28"/>
                 <w:szCs w:val="28"/>
-                <w:lang w:val="nl-NL"/>
               </w:rPr>
             </w:pPr>
             <w:r>
@@ -1601,36 +1713,24 @@
                 <w:b/>
                 <w:sz w:val="28"/>
                 <w:szCs w:val="28"/>
-                <w:lang w:val="nl-NL"/>
-              </w:rPr>
-              <w:t>1//</w:t>
+              </w:rPr>
+              <w:t>{deliverer_rank} {</w:t>
             </w:r>
             <w:r>
               <w:rPr>
                 <w:b/>
                 <w:sz w:val="28"/>
                 <w:szCs w:val="28"/>
-                <w:lang w:val="nl-NL"/>
-              </w:rPr>
-              <w:t xml:space="preserve"> </w:t>
+              </w:rPr>
+              <w:t>deliverer</w:t>
             </w:r>
             <w:r>
               <w:rPr>
                 <w:b/>
                 <w:sz w:val="28"/>
                 <w:szCs w:val="28"/>
-                <w:lang w:val="nl-NL"/>
-              </w:rPr>
-              <w:t xml:space="preserve">Nguyễn </w:t>
-            </w:r>
-            <w:r>
-              <w:rPr>
-                <w:b/>
-                <w:sz w:val="28"/>
-                <w:szCs w:val="28"/>
-                <w:lang w:val="nl-NL"/>
-              </w:rPr>
-              <w:t>Thái Khoa</w:t>
+              </w:rPr>
+              <w:t>}</w:t>
             </w:r>
           </w:p>
         </w:tc>
@@ -1690,9 +1790,8 @@
                 <w:b/>
                 <w:sz w:val="28"/>
                 <w:szCs w:val="28"/>
-                <w:lang w:val="nl-NL"/>
-              </w:rPr>
-              <w:t>1// Trần Văn An</w:t>
+              </w:rPr>
+              <w:t>{receiver_rank} {receiver}</w:t>
             </w:r>
           </w:p>
         </w:tc>
@@ -2245,6 +2344,95 @@
     </w:lvl>
   </w:abstractNum>
   <w:abstractNum w:abstractNumId="5" w15:restartNumberingAfterBreak="0">
+    <w:nsid w:val="64310275"/>
+    <w:multiLevelType w:val="hybridMultilevel"/>
+    <w:tmpl w:val="B51EF112"/>
+    <w:lvl w:ilvl="0" w:tplc="08E47E1E">
+      <w:start w:val="1"/>
+      <w:numFmt w:val="decimal"/>
+      <w:lvlText w:val="%1."/>
+      <w:lvlJc w:val="left"/>
+      <w:pPr>
+        <w:ind w:left="1080" w:hanging="360"/>
+      </w:pPr>
+      <w:rPr>
+        <w:rFonts w:hint="default"/>
+      </w:rPr>
+    </w:lvl>
+    <w:lvl w:ilvl="1" w:tplc="04090019" w:tentative="1">
+      <w:start w:val="1"/>
+      <w:numFmt w:val="lowerLetter"/>
+      <w:lvlText w:val="%2."/>
+      <w:lvlJc w:val="left"/>
+      <w:pPr>
+        <w:ind w:left="1800" w:hanging="360"/>
+      </w:pPr>
+    </w:lvl>
+    <w:lvl w:ilvl="2" w:tplc="0409001B" w:tentative="1">
+      <w:start w:val="1"/>
+      <w:numFmt w:val="lowerRoman"/>
+      <w:lvlText w:val="%3."/>
+      <w:lvlJc w:val="right"/>
+      <w:pPr>
+        <w:ind w:left="2520" w:hanging="180"/>
+      </w:pPr>
+    </w:lvl>
+    <w:lvl w:ilvl="3" w:tplc="0409000F" w:tentative="1">
+      <w:start w:val="1"/>
+      <w:numFmt w:val="decimal"/>
+      <w:lvlText w:val="%4."/>
+      <w:lvlJc w:val="left"/>
+      <w:pPr>
+        <w:ind w:left="3240" w:hanging="360"/>
+      </w:pPr>
+    </w:lvl>
+    <w:lvl w:ilvl="4" w:tplc="04090019" w:tentative="1">
+      <w:start w:val="1"/>
+      <w:numFmt w:val="lowerLetter"/>
+      <w:lvlText w:val="%5."/>
+      <w:lvlJc w:val="left"/>
+      <w:pPr>
+        <w:ind w:left="3960" w:hanging="360"/>
+      </w:pPr>
+    </w:lvl>
+    <w:lvl w:ilvl="5" w:tplc="0409001B" w:tentative="1">
+      <w:start w:val="1"/>
+      <w:numFmt w:val="lowerRoman"/>
+      <w:lvlText w:val="%6."/>
+      <w:lvlJc w:val="right"/>
+      <w:pPr>
+        <w:ind w:left="4680" w:hanging="180"/>
+      </w:pPr>
+    </w:lvl>
+    <w:lvl w:ilvl="6" w:tplc="0409000F" w:tentative="1">
+      <w:start w:val="1"/>
+      <w:numFmt w:val="decimal"/>
+      <w:lvlText w:val="%7."/>
+      <w:lvlJc w:val="left"/>
+      <w:pPr>
+        <w:ind w:left="5400" w:hanging="360"/>
+      </w:pPr>
+    </w:lvl>
+    <w:lvl w:ilvl="7" w:tplc="04090019" w:tentative="1">
+      <w:start w:val="1"/>
+      <w:numFmt w:val="lowerLetter"/>
+      <w:lvlText w:val="%8."/>
+      <w:lvlJc w:val="left"/>
+      <w:pPr>
+        <w:ind w:left="6120" w:hanging="360"/>
+      </w:pPr>
+    </w:lvl>
+    <w:lvl w:ilvl="8" w:tplc="0409001B" w:tentative="1">
+      <w:start w:val="1"/>
+      <w:numFmt w:val="lowerRoman"/>
+      <w:lvlText w:val="%9."/>
+      <w:lvlJc w:val="right"/>
+      <w:pPr>
+        <w:ind w:left="6840" w:hanging="180"/>
+      </w:pPr>
+    </w:lvl>
+  </w:abstractNum>
+  <w:abstractNum w:abstractNumId="6" w15:restartNumberingAfterBreak="0">
     <w:nsid w:val="6EA33A1A"/>
     <w:multiLevelType w:val="hybridMultilevel"/>
     <w:tmpl w:val="BC5A3CD6"/>
@@ -2333,7 +2521,7 @@
       </w:pPr>
     </w:lvl>
   </w:abstractNum>
-  <w:abstractNum w:abstractNumId="6" w15:restartNumberingAfterBreak="0">
+  <w:abstractNum w:abstractNumId="7" w15:restartNumberingAfterBreak="0">
     <w:nsid w:val="75F3357A"/>
     <w:multiLevelType w:val="hybridMultilevel"/>
     <w:tmpl w:val="B51EF112"/>
@@ -2423,7 +2611,7 @@
     </w:lvl>
   </w:abstractNum>
   <w:num w:numId="1">
-    <w:abstractNumId w:val="6"/>
+    <w:abstractNumId w:val="7"/>
   </w:num>
   <w:num w:numId="2">
     <w:abstractNumId w:val="1"/>
@@ -2462,7 +2650,7 @@
     <w:abstractNumId w:val="2"/>
   </w:num>
   <w:num w:numId="5">
-    <w:abstractNumId w:val="5"/>
+    <w:abstractNumId w:val="6"/>
   </w:num>
   <w:num w:numId="6">
     <w:abstractNumId w:val="4"/>
@@ -2502,6 +2690,9 @@
   </w:num>
   <w:num w:numId="9">
     <w:abstractNumId w:val="0"/>
+  </w:num>
+  <w:num w:numId="10">
+    <w:abstractNumId w:val="5"/>
   </w:num>
 </w:numbering>
 </file>
@@ -2885,7 +3076,7 @@
   <w:style w:type="paragraph" w:default="1" w:styleId="Normal">
     <w:name w:val="Normal"/>
     <w:qFormat/>
-    <w:rsid w:val="00E277C7"/>
+    <w:rsid w:val="00F73A4C"/>
     <w:rPr>
       <w:sz w:val="24"/>
       <w:szCs w:val="24"/>
@@ -3308,7 +3499,7 @@
 </file>
 
 <file path=customXml/itemProps1.xml><?xml version="1.0" encoding="utf-8"?>
-<ds:datastoreItem xmlns:ds="http://schemas.openxmlformats.org/officeDocument/2006/customXml" ds:itemID="{DCCC85E0-0B60-4FCD-9D24-A68A40840024}">
+<ds:datastoreItem xmlns:ds="http://schemas.openxmlformats.org/officeDocument/2006/customXml" ds:itemID="{95AB724C-3B59-4F86-8567-8A804F783D65}">
   <ds:schemaRefs>
     <ds:schemaRef ds:uri="http://schemas.openxmlformats.org/officeDocument/2006/bibliography"/>
   </ds:schemaRefs>

</xml_diff>